<commit_message>
docs(exec-strategy): add agentic-momentum section + broaden Oracle scope
Adds a new §1 with six market stats from Gartner / Microsoft Work Trend Index / McKinsey to frame the FY26 forcing context, and broadens the document scope from Oracle Fusion to all Oracle data estates (Database, Exadata, OCI, on-prem) wherever the original phrasing was un-intentionally narrow. Rebuilds .docx and .pdf to match.
</commit_message>
<xml_diff>
--- a/docs/microsoft-exec-strategy.docx
+++ b/docs/microsoft-exec-strategy.docx
@@ -2,6 +2,14 @@
 <file path=word/document.xml><?xml version="1.0" encoding="utf-8"?>
 <w:document xmlns:w="http://schemas.openxmlformats.org/wordprocessingml/2006/main" xmlns:m="http://schemas.openxmlformats.org/officeDocument/2006/math" xmlns:r="http://schemas.openxmlformats.org/officeDocument/2006/relationships" xmlns:o="urn:schemas-microsoft-com:office:office" xmlns:v="urn:schemas-microsoft-com:vml" xmlns:w10="urn:schemas-microsoft-com:office:word" xmlns:a="http://schemas.openxmlformats.org/drawingml/2006/main" xmlns:pic="http://schemas.openxmlformats.org/drawingml/2006/picture" xmlns:wp="http://schemas.openxmlformats.org/drawingml/2006/wordprocessingDrawing">
   <w:body>
+    <w:p>
+      <w:pPr>
+        <w:pStyle w:val="Title"/>
+      </w:pPr>
+      <w:r>
+        <w:t xml:space="preserve">Microsoft Executive Strategy ��� The Oracle Alliance for Agentic Transformation</w:t>
+      </w:r>
+    </w:p>
     <w:sdt>
       <w:sdtPr>
         <w:docPartObj>
@@ -28,7 +36,7 @@
         </w:p>
       </w:sdtContent>
     </w:sdt>
-    <w:bookmarkStart w:id="44" w:name="microsoft-executive-strategy"/>
+    <w:bookmarkStart w:id="45" w:name="microsoft-executive-strategy"/>
     <w:p>
       <w:pPr>
         <w:pStyle w:val="Heading1"/>
@@ -280,13 +288,515 @@
       </w:r>
     </w:p>
     <w:bookmarkEnd w:id="21"/>
-    <w:bookmarkStart w:id="22" w:name="Xf687c69cd89ad937ab47b5b49ac6b69bbd221a3"/>
+    <w:bookmarkStart w:id="22" w:name="X6c93159f7269b9e30584d0eae4e0a6ad533505b"/>
     <w:p>
       <w:pPr>
         <w:pStyle w:val="Heading2"/>
       </w:pPr>
       <w:r>
-        <w:t xml:space="preserve">1. Why now</w:t>
+        <w:t xml:space="preserve">1. Agentic momentum — the public-data picture</w:t>
+      </w:r>
+    </w:p>
+    <w:p>
+      <w:pPr>
+        <w:pStyle w:val="FirstParagraph"/>
+      </w:pPr>
+      <w:r>
+        <w:t xml:space="preserve">Six numbers from independent sources frame the FY26 window. They are not our numbers — they are the market's.</w:t>
+      </w:r>
+    </w:p>
+    <w:tbl>
+      <w:tblPr>
+        <w:tblStyle w:val="Table"/>
+        <w:tblW w:type="auto" w:w="0"/>
+        <w:tblLook w:firstRow="1" w:lastRow="0" w:firstColumn="0" w:lastColumn="0" w:noHBand="0" w:noVBand="0" w:val="0020"/>
+        <w:jc w:val="start"/>
+      </w:tblPr>
+      <w:tblGrid>
+        <w:gridCol w:w="1980"/>
+        <w:gridCol w:w="1980"/>
+        <w:gridCol w:w="1980"/>
+        <w:gridCol w:w="1980"/>
+      </w:tblGrid>
+      <w:tr>
+        <w:trPr>
+          <w:tblHeader w:val="true"/>
+        </w:trPr>
+        <w:tc>
+          <w:tcPr/>
+          <w:p>
+            <w:pPr>
+              <w:pStyle w:val="Compact"/>
+            </w:pPr>
+          </w:p>
+        </w:tc>
+        <w:tc>
+          <w:tcPr/>
+          <w:p>
+            <w:pPr>
+              <w:pStyle w:val="Compact"/>
+              <w:jc w:val="left"/>
+            </w:pPr>
+            <w:r>
+              <w:t xml:space="preserve">Stat</w:t>
+            </w:r>
+          </w:p>
+        </w:tc>
+        <w:tc>
+          <w:tcPr/>
+          <w:p>
+            <w:pPr>
+              <w:pStyle w:val="Compact"/>
+              <w:jc w:val="left"/>
+            </w:pPr>
+            <w:r>
+              <w:t xml:space="preserve">Implication for Microsoft</w:t>
+            </w:r>
+          </w:p>
+        </w:tc>
+        <w:tc>
+          <w:tcPr/>
+          <w:p>
+            <w:pPr>
+              <w:pStyle w:val="Compact"/>
+              <w:jc w:val="left"/>
+            </w:pPr>
+            <w:r>
+              <w:t xml:space="preserve">Source</w:t>
+            </w:r>
+          </w:p>
+        </w:tc>
+      </w:tr>
+      <w:tr>
+        <w:tc>
+          <w:tcPr/>
+          <w:p>
+            <w:pPr>
+              <w:pStyle w:val="Compact"/>
+              <w:jc w:val="left"/>
+            </w:pPr>
+            <w:r>
+              <w:rPr>
+                <w:bCs/>
+                <w:b/>
+              </w:rPr>
+              <w:t xml:space="preserve">33%</w:t>
+            </w:r>
+          </w:p>
+        </w:tc>
+        <w:tc>
+          <w:tcPr/>
+          <w:p>
+            <w:pPr>
+              <w:pStyle w:val="Compact"/>
+              <w:jc w:val="left"/>
+            </w:pPr>
+            <w:r>
+              <w:t xml:space="preserve">of enterprise software applications will include agentic AI by 2028 — up from &lt;1% in 2024</w:t>
+            </w:r>
+          </w:p>
+        </w:tc>
+        <w:tc>
+          <w:tcPr/>
+          <w:p>
+            <w:pPr>
+              <w:pStyle w:val="Compact"/>
+              <w:jc w:val="left"/>
+            </w:pPr>
+            <w:r>
+              <w:t xml:space="preserve">Agentic is becoming a default feature of every enterprise app, not an option</w:t>
+            </w:r>
+          </w:p>
+        </w:tc>
+        <w:tc>
+          <w:tcPr/>
+          <w:p>
+            <w:pPr>
+              <w:pStyle w:val="Compact"/>
+              <w:jc w:val="left"/>
+            </w:pPr>
+            <w:r>
+              <w:t xml:space="preserve">Gartner, Oct 2024</w:t>
+            </w:r>
+          </w:p>
+        </w:tc>
+      </w:tr>
+      <w:tr>
+        <w:tc>
+          <w:tcPr/>
+          <w:p>
+            <w:pPr>
+              <w:pStyle w:val="Compact"/>
+              <w:jc w:val="left"/>
+            </w:pPr>
+            <w:r>
+              <w:rPr>
+                <w:bCs/>
+                <w:b/>
+              </w:rPr>
+              <w:t xml:space="preserve">15%</w:t>
+            </w:r>
+          </w:p>
+        </w:tc>
+        <w:tc>
+          <w:tcPr/>
+          <w:p>
+            <w:pPr>
+              <w:pStyle w:val="Compact"/>
+              <w:jc w:val="left"/>
+            </w:pPr>
+            <w:r>
+              <w:t xml:space="preserve">of day-to-day work decisions will be made autonomously by agentic AI by 2028 — up from 0% in 2024</w:t>
+            </w:r>
+          </w:p>
+        </w:tc>
+        <w:tc>
+          <w:tcPr/>
+          <w:p>
+            <w:pPr>
+              <w:pStyle w:val="Compact"/>
+              <w:jc w:val="left"/>
+            </w:pPr>
+            <w:r>
+              <w:t xml:space="preserve">The decision loop itself is moving inside the model</w:t>
+            </w:r>
+          </w:p>
+        </w:tc>
+        <w:tc>
+          <w:tcPr/>
+          <w:p>
+            <w:pPr>
+              <w:pStyle w:val="Compact"/>
+              <w:jc w:val="left"/>
+            </w:pPr>
+            <w:r>
+              <w:t xml:space="preserve">Gartner, Oct 2024</w:t>
+            </w:r>
+          </w:p>
+        </w:tc>
+      </w:tr>
+      <w:tr>
+        <w:tc>
+          <w:tcPr/>
+          <w:p>
+            <w:pPr>
+              <w:pStyle w:val="Compact"/>
+              <w:jc w:val="left"/>
+            </w:pPr>
+            <w:r>
+              <w:rPr>
+                <w:bCs/>
+                <w:b/>
+              </w:rPr>
+              <w:t xml:space="preserve">$450B+</w:t>
+            </w:r>
+          </w:p>
+        </w:tc>
+        <w:tc>
+          <w:tcPr/>
+          <w:p>
+            <w:pPr>
+              <w:pStyle w:val="Compact"/>
+              <w:jc w:val="left"/>
+            </w:pPr>
+            <w:r>
+              <w:t xml:space="preserve">projected agentic enterprise-software market by 2035 — ~30% of total enterprise app revenue, up from 2% in 2025</w:t>
+            </w:r>
+          </w:p>
+        </w:tc>
+        <w:tc>
+          <w:tcPr/>
+          <w:p>
+            <w:pPr>
+              <w:pStyle w:val="Compact"/>
+              <w:jc w:val="left"/>
+            </w:pPr>
+            <w:r>
+              <w:t xml:space="preserve">This is a category-creation event, not a feature war</w:t>
+            </w:r>
+          </w:p>
+        </w:tc>
+        <w:tc>
+          <w:tcPr/>
+          <w:p>
+            <w:pPr>
+              <w:pStyle w:val="Compact"/>
+              <w:jc w:val="left"/>
+            </w:pPr>
+            <w:r>
+              <w:t xml:space="preserve">Gartner, Aug 2025</w:t>
+            </w:r>
+          </w:p>
+        </w:tc>
+      </w:tr>
+      <w:tr>
+        <w:tc>
+          <w:tcPr/>
+          <w:p>
+            <w:pPr>
+              <w:pStyle w:val="Compact"/>
+              <w:jc w:val="left"/>
+            </w:pPr>
+            <w:r>
+              <w:rPr>
+                <w:bCs/>
+                <w:b/>
+              </w:rPr>
+              <w:t xml:space="preserve">82% / 81%</w:t>
+            </w:r>
+          </w:p>
+        </w:tc>
+        <w:tc>
+          <w:tcPr/>
+          <w:p>
+            <w:pPr>
+              <w:pStyle w:val="Compact"/>
+              <w:jc w:val="left"/>
+            </w:pPr>
+            <w:r>
+              <w:t xml:space="preserve">of leaders plan to use agents to expand workforce capacity in the next 12–18 months / expect agents integrated into operations</w:t>
+            </w:r>
+          </w:p>
+        </w:tc>
+        <w:tc>
+          <w:tcPr/>
+          <w:p>
+            <w:pPr>
+              <w:pStyle w:val="Compact"/>
+              <w:jc w:val="left"/>
+            </w:pPr>
+            <w:r>
+              <w:t xml:space="preserve">Demand has crossed from interest to budget</w:t>
+            </w:r>
+          </w:p>
+        </w:tc>
+        <w:tc>
+          <w:tcPr/>
+          <w:p>
+            <w:pPr>
+              <w:pStyle w:val="Compact"/>
+              <w:jc w:val="left"/>
+            </w:pPr>
+            <w:r>
+              <w:t xml:space="preserve">Microsoft 2025 Annual Work Trend Index</w:t>
+            </w:r>
+          </w:p>
+        </w:tc>
+      </w:tr>
+      <w:tr>
+        <w:tc>
+          <w:tcPr/>
+          <w:p>
+            <w:pPr>
+              <w:pStyle w:val="Compact"/>
+              <w:jc w:val="left"/>
+            </w:pPr>
+            <w:r>
+              <w:rPr>
+                <w:bCs/>
+                <w:b/>
+              </w:rPr>
+              <w:t xml:space="preserve">88% / 5.5%</w:t>
+            </w:r>
+          </w:p>
+        </w:tc>
+        <w:tc>
+          <w:tcPr/>
+          <w:p>
+            <w:pPr>
+              <w:pStyle w:val="Compact"/>
+              <w:jc w:val="left"/>
+            </w:pPr>
+            <w:r>
+              <w:t xml:space="preserve">of organisations now use AI in at least one function — but only 5.5% see real financial returns</w:t>
+            </w:r>
+          </w:p>
+        </w:tc>
+        <w:tc>
+          <w:tcPr/>
+          <w:p>
+            <w:pPr>
+              <w:pStyle w:val="Compact"/>
+              <w:jc w:val="left"/>
+            </w:pPr>
+            <w:r>
+              <w:t xml:space="preserve">The gap is data and integration, not model capability — the alliance's exact territory</w:t>
+            </w:r>
+          </w:p>
+        </w:tc>
+        <w:tc>
+          <w:tcPr/>
+          <w:p>
+            <w:pPr>
+              <w:pStyle w:val="Compact"/>
+              <w:jc w:val="left"/>
+            </w:pPr>
+            <w:r>
+              <w:t xml:space="preserve">McKinsey State of AI 2025</w:t>
+            </w:r>
+          </w:p>
+        </w:tc>
+      </w:tr>
+      <w:tr>
+        <w:tc>
+          <w:tcPr/>
+          <w:p>
+            <w:pPr>
+              <w:pStyle w:val="Compact"/>
+              <w:jc w:val="left"/>
+            </w:pPr>
+            <w:r>
+              <w:rPr>
+                <w:bCs/>
+                <w:b/>
+              </w:rPr>
+              <w:t xml:space="preserve">40%+</w:t>
+            </w:r>
+          </w:p>
+        </w:tc>
+        <w:tc>
+          <w:tcPr/>
+          <w:p>
+            <w:pPr>
+              <w:pStyle w:val="Compact"/>
+              <w:jc w:val="left"/>
+            </w:pPr>
+            <w:r>
+              <w:t xml:space="preserve">of agentic AI projects will be cancelled by end of 2027 — escalating costs, unclear value, weak governance</w:t>
+            </w:r>
+          </w:p>
+        </w:tc>
+        <w:tc>
+          <w:tcPr/>
+          <w:p>
+            <w:pPr>
+              <w:pStyle w:val="Compact"/>
+              <w:jc w:val="left"/>
+            </w:pPr>
+            <w:r>
+              <w:t xml:space="preserve">Architecture choices made now decide who survives the cull</w:t>
+            </w:r>
+          </w:p>
+        </w:tc>
+        <w:tc>
+          <w:tcPr/>
+          <w:p>
+            <w:pPr>
+              <w:pStyle w:val="Compact"/>
+              <w:jc w:val="left"/>
+            </w:pPr>
+            <w:r>
+              <w:t xml:space="preserve">Gartner, Jun 2025</w:t>
+            </w:r>
+          </w:p>
+        </w:tc>
+      </w:tr>
+    </w:tbl>
+    <w:p>
+      <w:pPr>
+        <w:pStyle w:val="BodyText"/>
+      </w:pPr>
+      <w:r>
+        <w:rPr>
+          <w:bCs/>
+          <w:b/>
+        </w:rPr>
+        <w:t xml:space="preserve">The pattern.</w:t>
+      </w:r>
+      <w:r>
+        <w:t xml:space="preserve"> </w:t>
+      </w:r>
+      <w:r>
+        <w:t xml:space="preserve">Adoption is mass-market, but value capture is rare. Organisations that bolt agents onto disconnected data stacks stall; organisations that pair their</w:t>
+      </w:r>
+      <w:r>
+        <w:t xml:space="preserve"> </w:t>
+      </w:r>
+      <w:r>
+        <w:rPr>
+          <w:bCs/>
+          <w:b/>
+        </w:rPr>
+        <w:t xml:space="preserve">data of record</w:t>
+      </w:r>
+      <w:r>
+        <w:t xml:space="preserve"> </w:t>
+      </w:r>
+      <w:r>
+        <w:t xml:space="preserve">with their</w:t>
+      </w:r>
+      <w:r>
+        <w:t xml:space="preserve"> </w:t>
+      </w:r>
+      <w:r>
+        <w:rPr>
+          <w:bCs/>
+          <w:b/>
+        </w:rPr>
+        <w:t xml:space="preserve">system of work</w:t>
+      </w:r>
+      <w:r>
+        <w:t xml:space="preserve"> </w:t>
+      </w:r>
+      <w:r>
+        <w:t xml:space="preserve">compound results. For the Oracle installed base, the seam between</w:t>
+      </w:r>
+      <w:r>
+        <w:t xml:space="preserve"> </w:t>
+      </w:r>
+      <w:r>
+        <w:rPr>
+          <w:bCs/>
+          <w:b/>
+        </w:rPr>
+        <w:t xml:space="preserve">Oracle data anywhere</w:t>
+      </w:r>
+      <w:r>
+        <w:t xml:space="preserve"> </w:t>
+      </w:r>
+      <w:r>
+        <w:t xml:space="preserve">and</w:t>
+      </w:r>
+      <w:r>
+        <w:t xml:space="preserve"> </w:t>
+      </w:r>
+      <w:r>
+        <w:rPr>
+          <w:bCs/>
+          <w:b/>
+        </w:rPr>
+        <w:t xml:space="preserve">Microsoft Copilot</w:t>
+      </w:r>
+      <w:r>
+        <w:t xml:space="preserve"> </w:t>
+      </w:r>
+      <w:r>
+        <w:t xml:space="preserve">is among the largest unaddressed opportunities in enterprise software — and first-mover lead time compounds every quarter the alliance is shipping.</w:t>
+      </w:r>
+    </w:p>
+    <w:p>
+      <w:pPr>
+        <w:pStyle w:val="BlockText"/>
+      </w:pPr>
+      <w:r>
+        <w:t xml:space="preserve">Sources: public Gartner press releases (Oct 2024, Jun 2025, Aug 2025); Microsoft 2025 Annual Work Trend Index; McKinsey State of AI 2025.</w:t>
+      </w:r>
+    </w:p>
+    <w:p>
+      <w:r>
+        <w:pict>
+          <v:rect style="width:0;height:1.5pt" o:hralign="center" o:hrstd="t" o:hr="t"/>
+        </w:pict>
+      </w:r>
+    </w:p>
+    <w:bookmarkEnd w:id="22"/>
+    <w:bookmarkStart w:id="23" w:name="X09b412b1508287c341f7bfe9eca77e644b2e1cd"/>
+    <w:p>
+      <w:pPr>
+        <w:pStyle w:val="Heading2"/>
+      </w:pPr>
+      <w:r>
+        <w:t xml:space="preserve">2. Why now</w:t>
       </w:r>
     </w:p>
     <w:p>
@@ -436,14 +946,14 @@
         </w:pict>
       </w:r>
     </w:p>
-    <w:bookmarkEnd w:id="22"/>
-    <w:bookmarkStart w:id="23" w:name="X0cbfdaab23ff19c887e7d5c4bd342826921b251"/>
+    <w:bookmarkEnd w:id="23"/>
+    <w:bookmarkStart w:id="24" w:name="X2737127235b87cd535ab04d569a5b7ac3f34f0d"/>
     <w:p>
       <w:pPr>
         <w:pStyle w:val="Heading2"/>
       </w:pPr>
       <w:r>
-        <w:t xml:space="preserve">2. The thesis — closing the seam</w:t>
+        <w:t xml:space="preserve">3. The thesis — closing the seam</w:t>
       </w:r>
     </w:p>
     <w:p>
@@ -544,7 +1054,20 @@
               <w:jc w:val="left"/>
             </w:pPr>
             <w:r>
-              <w:t xml:space="preserve">Authoritative customer, supplier, employee, financial, transactional data — Fusion SaaS, Database@Azure, OCI, on-premises.</w:t>
+              <w:t xml:space="preserve">Authoritative customer, supplier, employee, financial, transactional data — across</w:t>
+            </w:r>
+            <w:r>
+              <w:t xml:space="preserve"> </w:t>
+            </w:r>
+            <w:r>
+              <w:rPr>
+                <w:bCs/>
+                <w:b/>
+              </w:rPr>
+              <w:t xml:space="preserve">all Oracle estates</w:t>
+            </w:r>
+            <w:r>
+              <w:t xml:space="preserve">: Fusion SaaS, Oracle Database@Azure, Oracle Database on OCI / Exadata Cloud, and Oracle on-premises (Exadata, RAC).</w:t>
             </w:r>
           </w:p>
         </w:tc>
@@ -675,14 +1198,14 @@
         </w:pict>
       </w:r>
     </w:p>
-    <w:bookmarkEnd w:id="23"/>
-    <w:bookmarkStart w:id="24" w:name="X4879725e44c536f741ce5765f3419127e29b460"/>
+    <w:bookmarkEnd w:id="24"/>
+    <w:bookmarkStart w:id="25" w:name="Xa4859160412e08b983bc847f6481c4b40d781a1"/>
     <w:p>
       <w:pPr>
         <w:pStyle w:val="Heading2"/>
       </w:pPr>
       <w:r>
-        <w:t xml:space="preserve">3. What we sell — the four-tier progression</w:t>
+        <w:t xml:space="preserve">4. What we sell — the four-tier progression</w:t>
       </w:r>
     </w:p>
     <w:p>
@@ -1073,7 +1596,23 @@
         <w:pStyle w:val="BodyText"/>
       </w:pPr>
       <w:r>
-        <w:t xml:space="preserve">Three flagship demo scenarios, identical structure:</w:t>
+        <w:t xml:space="preserve">Three flagship demo scenarios. The data anchor in each is shown in parentheses; the same pattern extends to</w:t>
+      </w:r>
+      <w:r>
+        <w:t xml:space="preserve"> </w:t>
+      </w:r>
+      <w:r>
+        <w:rPr>
+          <w:bCs/>
+          <w:b/>
+        </w:rPr>
+        <w:t xml:space="preserve">any Oracle data domain</w:t>
+      </w:r>
+      <w:r>
+        <w:t xml:space="preserve"> </w:t>
+      </w:r>
+      <w:r>
+        <w:t xml:space="preserve">the customer runs — Oracle Database, Exadata Cloud, OCI workloads, on-prem — wherever their system of record actually sits.</w:t>
       </w:r>
     </w:p>
     <w:p>
@@ -1095,7 +1634,7 @@
         <w:t xml:space="preserve"> </w:t>
       </w:r>
       <w:r>
-        <w:t xml:space="preserve">(Fusion SCM / Procurement) —</w:t>
+        <w:t xml:space="preserve">(Oracle SCM data — Fusion SCM / Procurement, plus supplier-master and PO data wherever it lives in the Oracle estate) —</w:t>
       </w:r>
       <w:r>
         <w:t xml:space="preserve"> </w:t>
@@ -1133,7 +1672,7 @@
         <w:t xml:space="preserve"> </w:t>
       </w:r>
       <w:r>
-        <w:t xml:space="preserve">(Fusion HCM) —</w:t>
+        <w:t xml:space="preserve">(Oracle HCM data — Fusion HCM, plus any Oracle DB-resident workforce data) —</w:t>
       </w:r>
       <w:r>
         <w:t xml:space="preserve"> </w:t>
@@ -1171,7 +1710,7 @@
         <w:t xml:space="preserve"> </w:t>
       </w:r>
       <w:r>
-        <w:t xml:space="preserve">(Fusion CX) —</w:t>
+        <w:t xml:space="preserve">(Oracle CX data — Fusion CX, plus any Oracle DB-resident customer / service data) —</w:t>
       </w:r>
       <w:r>
         <w:t xml:space="preserve"> </w:t>
@@ -1195,7 +1734,7 @@
         <w:pStyle w:val="FirstParagraph"/>
       </w:pPr>
       <w:r>
-        <w:t xml:space="preserve">These three are the seed demos. The industry blueprints (§6) are the production line.</w:t>
+        <w:t xml:space="preserve">These three are the seed demos. The industry blueprints (§7) are the production line.</w:t>
       </w:r>
     </w:p>
     <w:p>
@@ -1205,17 +1744,17 @@
         </w:pict>
       </w:r>
     </w:p>
-    <w:bookmarkEnd w:id="24"/>
-    <w:bookmarkStart w:id="30" w:name="Xa4526db12765d1fccca11402819e9f14f06deef"/>
+    <w:bookmarkEnd w:id="25"/>
+    <w:bookmarkStart w:id="31" w:name="Xc526bda9d56eb61cba8b8887f47305b14a256e6"/>
     <w:p>
       <w:pPr>
         <w:pStyle w:val="Heading2"/>
       </w:pPr>
       <w:r>
-        <w:t xml:space="preserve">4. What we ship — three patterns, two bridges</w:t>
-      </w:r>
-    </w:p>
-    <w:bookmarkStart w:id="25" w:name="three-integration-patterns"/>
+        <w:t xml:space="preserve">5. What we ship — three patterns, two bridges</w:t>
+      </w:r>
+    </w:p>
+    <w:bookmarkStart w:id="26" w:name="three-integration-patterns"/>
     <w:p>
       <w:pPr>
         <w:pStyle w:val="Heading3"/>
@@ -1323,7 +1862,23 @@
               <w:jc w:val="left"/>
             </w:pPr>
             <w:r>
-              <w:t xml:space="preserve">Mirror Fusion / DB@Azure / OCI / on-prem into Microsoft Fabric so Copilot can reason over it</w:t>
+              <w:t xml:space="preserve">Mirror</w:t>
+            </w:r>
+            <w:r>
+              <w:t xml:space="preserve"> </w:t>
+            </w:r>
+            <w:r>
+              <w:rPr>
+                <w:bCs/>
+                <w:b/>
+              </w:rPr>
+              <w:t xml:space="preserve">all Oracle data estates</w:t>
+            </w:r>
+            <w:r>
+              <w:t xml:space="preserve"> </w:t>
+            </w:r>
+            <w:r>
+              <w:t xml:space="preserve">— Fusion SaaS, Database@Azure, Database on OCI / Exadata Cloud, Oracle on-prem (Exadata, RAC) — into Microsoft Fabric so Copilot can reason over it</w:t>
             </w:r>
           </w:p>
         </w:tc>
@@ -1431,7 +1986,20 @@
               <w:jc w:val="left"/>
             </w:pPr>
             <w:r>
-              <w:t xml:space="preserve">Oracle-native agents (Fusion AI Agents, OCI workloads) participate in Copilot via MCP</w:t>
+              <w:t xml:space="preserve">Oracle-native agents (Fusion AI Agents,</w:t>
+            </w:r>
+            <w:r>
+              <w:t xml:space="preserve"> </w:t>
+            </w:r>
+            <w:r>
+              <w:rPr>
+                <w:bCs/>
+                <w:b/>
+              </w:rPr>
+              <w:t xml:space="preserve">Oracle Database AI agents</w:t>
+            </w:r>
+            <w:r>
+              <w:t xml:space="preserve">, OCI-hosted workloads, partner agents on Oracle data) participate in Copilot via MCP</w:t>
             </w:r>
           </w:p>
         </w:tc>
@@ -1449,8 +2017,8 @@
         </w:tc>
       </w:tr>
     </w:tbl>
-    <w:bookmarkEnd w:id="25"/>
-    <w:bookmarkStart w:id="26" w:name="two-bridges-the-joint-accelerators"/>
+    <w:bookmarkEnd w:id="26"/>
+    <w:bookmarkStart w:id="27" w:name="two-bridges-the-joint-accelerators"/>
     <w:p>
       <w:pPr>
         <w:pStyle w:val="Heading3"/>
@@ -1597,8 +2165,8 @@
         </w:tc>
       </w:tr>
     </w:tbl>
-    <w:bookmarkEnd w:id="26"/>
-    <w:bookmarkStart w:id="27" w:name="cross-cutting"/>
+    <w:bookmarkEnd w:id="27"/>
+    <w:bookmarkStart w:id="28" w:name="cross-cutting"/>
     <w:p>
       <w:pPr>
         <w:pStyle w:val="Heading3"/>
@@ -1615,8 +2183,8 @@
         <w:t xml:space="preserve">Identity (Entra ID + Oracle IAM) · Observability (Foundry traces + Application Insights + Purview audit + Oracle Audit Vault) · Quality (Foundry evals + golden datasets) · FinOps (Azure Cost Management + OCI cost analytics) · Reliability (joint SLA, single point of accountability per workflow) · Open standards (MCP, A2A, OpenLineage, OAuth 2.0, OData, OpenAPI).</w:t>
       </w:r>
     </w:p>
-    <w:bookmarkEnd w:id="27"/>
-    <w:bookmarkStart w:id="28" w:name="performance-targets"/>
+    <w:bookmarkEnd w:id="28"/>
+    <w:bookmarkStart w:id="29" w:name="performance-targets"/>
     <w:p>
       <w:pPr>
         <w:pStyle w:val="Heading3"/>
@@ -1713,8 +2281,8 @@
         <w:t xml:space="preserve">&lt; 5 min RTO</w:t>
       </w:r>
     </w:p>
-    <w:bookmarkEnd w:id="28"/>
-    <w:bookmarkStart w:id="29" w:name="compliance-posture"/>
+    <w:bookmarkEnd w:id="29"/>
+    <w:bookmarkStart w:id="30" w:name="compliance-posture"/>
     <w:p>
       <w:pPr>
         <w:pStyle w:val="Heading3"/>
@@ -1764,15 +2332,15 @@
         </w:pict>
       </w:r>
     </w:p>
-    <w:bookmarkEnd w:id="29"/>
     <w:bookmarkEnd w:id="30"/>
-    <w:bookmarkStart w:id="31" w:name="Xa67af51bdc0d687737859f4e1137855ba1f341c"/>
+    <w:bookmarkEnd w:id="31"/>
+    <w:bookmarkStart w:id="32" w:name="X6f023bdc9e5231397842ad2656367553a1a16ad"/>
     <w:p>
       <w:pPr>
         <w:pStyle w:val="Heading2"/>
       </w:pPr>
       <w:r>
-        <w:t xml:space="preserve">5. The economics — joint consumption flywheel</w:t>
+        <w:t xml:space="preserve">6. The economics — joint consumption flywheel</w:t>
       </w:r>
     </w:p>
     <w:p>
@@ -2132,17 +2700,17 @@
         </w:pict>
       </w:r>
     </w:p>
-    <w:bookmarkEnd w:id="31"/>
-    <w:bookmarkStart w:id="35" w:name="Xd4d3565a55bad5e0ff603941fa518e2b69be46f"/>
+    <w:bookmarkEnd w:id="32"/>
+    <w:bookmarkStart w:id="36" w:name="Xa2128040325d5665dfdff7cd440cf4e1544274c"/>
     <w:p>
       <w:pPr>
         <w:pStyle w:val="Heading2"/>
       </w:pPr>
       <w:r>
-        <w:t xml:space="preserve">6. The market — competition, migrations, industry blueprints</w:t>
-      </w:r>
-    </w:p>
-    <w:bookmarkStart w:id="32" w:name="competitive-frame"/>
+        <w:t xml:space="preserve">7. The market — competition, migrations, industry blueprints</w:t>
+      </w:r>
+    </w:p>
+    <w:bookmarkStart w:id="33" w:name="competitive-frame"/>
     <w:p>
       <w:pPr>
         <w:pStyle w:val="Heading3"/>
@@ -2341,8 +2909,8 @@
         </w:tc>
       </w:tr>
     </w:tbl>
-    <w:bookmarkEnd w:id="32"/>
-    <w:bookmarkStart w:id="33" w:name="migration-patterns"/>
+    <w:bookmarkEnd w:id="33"/>
+    <w:bookmarkStart w:id="34" w:name="migration-patterns"/>
     <w:p>
       <w:pPr>
         <w:pStyle w:val="Heading3"/>
@@ -2617,8 +3185,8 @@
         </w:tc>
       </w:tr>
     </w:tbl>
-    <w:bookmarkEnd w:id="33"/>
-    <w:bookmarkStart w:id="34" w:name="Xc0111fce6e934253a56b3866859f9d7f146b812"/>
+    <w:bookmarkEnd w:id="34"/>
+    <w:bookmarkStart w:id="35" w:name="Xc0111fce6e934253a56b3866859f9d7f146b812"/>
     <w:p>
       <w:pPr>
         <w:pStyle w:val="Heading3"/>
@@ -2730,7 +3298,23 @@
               <w:jc w:val="left"/>
             </w:pPr>
             <w:r>
-              <w:t xml:space="preserve">OFSAA · Fusion ERP</w:t>
+              <w:t xml:space="preserve">OFSAA · Fusion ERP ·</w:t>
+            </w:r>
+            <w:r>
+              <w:t xml:space="preserve"> </w:t>
+            </w:r>
+            <w:r>
+              <w:rPr>
+                <w:bCs/>
+                <w:b/>
+              </w:rPr>
+              <w:t xml:space="preserve">Oracle Database</w:t>
+            </w:r>
+            <w:r>
+              <w:t xml:space="preserve"> </w:t>
+            </w:r>
+            <w:r>
+              <w:t xml:space="preserve">(positions, risk warehouses, regulatory submissions)</w:t>
             </w:r>
           </w:p>
         </w:tc>
@@ -2784,7 +3368,23 @@
               <w:jc w:val="left"/>
             </w:pPr>
             <w:r>
-              <w:t xml:space="preserve">Fusion SCM · Procurement · IoT Cloud</w:t>
+              <w:t xml:space="preserve">Fusion SCM · Procurement · IoT Cloud ·</w:t>
+            </w:r>
+            <w:r>
+              <w:t xml:space="preserve"> </w:t>
+            </w:r>
+            <w:r>
+              <w:rPr>
+                <w:bCs/>
+                <w:b/>
+              </w:rPr>
+              <w:t xml:space="preserve">Oracle DB / Exadata</w:t>
+            </w:r>
+            <w:r>
+              <w:t xml:space="preserve"> </w:t>
+            </w:r>
+            <w:r>
+              <w:t xml:space="preserve">(MES, plant historian, SCADA)</w:t>
             </w:r>
           </w:p>
         </w:tc>
@@ -2838,7 +3438,23 @@
               <w:jc w:val="left"/>
             </w:pPr>
             <w:r>
-              <w:t xml:space="preserve">Oracle Retail Suite · Fusion CX · Loyalty</w:t>
+              <w:t xml:space="preserve">Oracle Retail Suite · Fusion CX · Loyalty ·</w:t>
+            </w:r>
+            <w:r>
+              <w:t xml:space="preserve"> </w:t>
+            </w:r>
+            <w:r>
+              <w:rPr>
+                <w:bCs/>
+                <w:b/>
+              </w:rPr>
+              <w:t xml:space="preserve">Oracle DB</w:t>
+            </w:r>
+            <w:r>
+              <w:t xml:space="preserve"> </w:t>
+            </w:r>
+            <w:r>
+              <w:t xml:space="preserve">(POS, store ops)</w:t>
             </w:r>
           </w:p>
         </w:tc>
@@ -2892,7 +3508,23 @@
               <w:jc w:val="left"/>
             </w:pPr>
             <w:r>
-              <w:t xml:space="preserve">Public Sector Cloud · Fusion HCM</w:t>
+              <w:t xml:space="preserve">Public Sector Cloud · Fusion HCM ·</w:t>
+            </w:r>
+            <w:r>
+              <w:t xml:space="preserve"> </w:t>
+            </w:r>
+            <w:r>
+              <w:rPr>
+                <w:bCs/>
+                <w:b/>
+              </w:rPr>
+              <w:t xml:space="preserve">Oracle DB</w:t>
+            </w:r>
+            <w:r>
+              <w:t xml:space="preserve"> </w:t>
+            </w:r>
+            <w:r>
+              <w:t xml:space="preserve">(case management, eligibility systems)</w:t>
             </w:r>
           </w:p>
         </w:tc>
@@ -2925,15 +3557,15 @@
         </w:pict>
       </w:r>
     </w:p>
-    <w:bookmarkEnd w:id="34"/>
     <w:bookmarkEnd w:id="35"/>
-    <w:bookmarkStart w:id="36" w:name="X4e08c72828ef307ea3c5ac8547c8a1e30c6143b"/>
+    <w:bookmarkEnd w:id="36"/>
+    <w:bookmarkStart w:id="37" w:name="X3ceec8a2a8886ae42be05237391d8048aec14c7"/>
     <w:p>
       <w:pPr>
         <w:pStyle w:val="Heading2"/>
       </w:pPr>
       <w:r>
-        <w:t xml:space="preserve">7. The build plan — phased roadmap</w:t>
+        <w:t xml:space="preserve">8. The build plan — phased roadmap</w:t>
       </w:r>
     </w:p>
     <w:tbl>
@@ -3406,14 +4038,14 @@
         </w:pict>
       </w:r>
     </w:p>
-    <w:bookmarkEnd w:id="36"/>
-    <w:bookmarkStart w:id="37" w:name="X301e62942de36bf6be3cacdbdc32d2813edf237"/>
+    <w:bookmarkEnd w:id="37"/>
+    <w:bookmarkStart w:id="38" w:name="X72040c9b73d8518b7c37fed60faa8b643c28805"/>
     <w:p>
       <w:pPr>
         <w:pStyle w:val="Heading2"/>
       </w:pPr>
       <w:r>
-        <w:t xml:space="preserve">8. The org — ownership across Microsoft</w:t>
+        <w:t xml:space="preserve">9. The org — ownership across Microsoft</w:t>
       </w:r>
     </w:p>
     <w:p>
@@ -3598,7 +4230,7 @@
               <w:jc w:val="left"/>
             </w:pPr>
             <w:r>
-              <w:t xml:space="preserve">Oracle Fusion product</w:t>
+              <w:t xml:space="preserve">Oracle product (Fusion + Database)</w:t>
             </w:r>
           </w:p>
         </w:tc>
@@ -4061,14 +4693,14 @@
         </w:pict>
       </w:r>
     </w:p>
-    <w:bookmarkEnd w:id="37"/>
-    <w:bookmarkStart w:id="38" w:name="X28bfd08755274b5c84c47d7f0e66f21c8edeaa8"/>
+    <w:bookmarkEnd w:id="38"/>
+    <w:bookmarkStart w:id="39" w:name="Xe1fe211670876f43de78730dd7bc7d65177afb8"/>
     <w:p>
       <w:pPr>
         <w:pStyle w:val="Heading2"/>
       </w:pPr>
       <w:r>
-        <w:t xml:space="preserve">9. Asks — what we need from this room</w:t>
+        <w:t xml:space="preserve">10. Asks — what we need from this room</w:t>
       </w:r>
     </w:p>
     <w:p>
@@ -4280,14 +4912,14 @@
         </w:pict>
       </w:r>
     </w:p>
-    <w:bookmarkEnd w:id="38"/>
-    <w:bookmarkStart w:id="39" w:name="Xd23567b368629d7d6e369ba0946f4da9ea6a469"/>
+    <w:bookmarkEnd w:id="39"/>
+    <w:bookmarkStart w:id="40" w:name="X820aeb45a1342b869f7652f82d815deeb080f14"/>
     <w:p>
       <w:pPr>
         <w:pStyle w:val="Heading2"/>
       </w:pPr>
       <w:r>
-        <w:t xml:space="preserve">10. Risks and mitigations</w:t>
+        <w:t xml:space="preserve">11. Risks and mitigations</w:t>
       </w:r>
     </w:p>
     <w:tbl>
@@ -4510,14 +5142,14 @@
         </w:pict>
       </w:r>
     </w:p>
-    <w:bookmarkEnd w:id="39"/>
-    <w:bookmarkStart w:id="40" w:name="X665714aea60113e821d97ed6844540869c7c3b2"/>
+    <w:bookmarkEnd w:id="40"/>
+    <w:bookmarkStart w:id="41" w:name="X15209d121ea5b8583d1eedbc886f8daeee5b0fa"/>
     <w:p>
       <w:pPr>
         <w:pStyle w:val="Heading2"/>
       </w:pPr>
       <w:r>
-        <w:t xml:space="preserve">11. First 30 / 60 / 90 days</w:t>
+        <w:t xml:space="preserve">12. First 30 / 60 / 90 days</w:t>
       </w:r>
     </w:p>
     <w:p>
@@ -4761,8 +5393,8 @@
         </w:pict>
       </w:r>
     </w:p>
-    <w:bookmarkEnd w:id="40"/>
-    <w:bookmarkStart w:id="43" w:name="appendix"/>
+    <w:bookmarkEnd w:id="41"/>
+    <w:bookmarkStart w:id="44" w:name="appendix"/>
     <w:p>
       <w:pPr>
         <w:pStyle w:val="Heading2"/>
@@ -4771,7 +5403,7 @@
         <w:t xml:space="preserve">Appendix</w:t>
       </w:r>
     </w:p>
-    <w:bookmarkStart w:id="41" w:name="a-reference-materials"/>
+    <w:bookmarkStart w:id="42" w:name="a-reference-materials"/>
     <w:p>
       <w:pPr>
         <w:pStyle w:val="Heading3"/>
@@ -4945,8 +5577,8 @@
         <w:t xml:space="preserve">/how-we-enable</w:t>
       </w:r>
     </w:p>
-    <w:bookmarkEnd w:id="41"/>
-    <w:bookmarkStart w:id="42" w:name="b-glossary"/>
+    <w:bookmarkEnd w:id="42"/>
+    <w:bookmarkStart w:id="43" w:name="b-glossary"/>
     <w:p>
       <w:pPr>
         <w:pStyle w:val="Heading3"/>
@@ -5131,9 +5763,9 @@
         <w:t xml:space="preserve">— Model Context Protocol for tool / agent participation.</w:t>
       </w:r>
     </w:p>
-    <w:bookmarkEnd w:id="42"/>
     <w:bookmarkEnd w:id="43"/>
     <w:bookmarkEnd w:id="44"/>
+    <w:bookmarkEnd w:id="45"/>
     <w:sectPr/>
   </w:body>
 </w:document>

</xml_diff>